<commit_message>
[PLAN-superpowers-research] Bước 2.2: Áp dụng đề xuất P1-P7 từ nghiên cứu obra/superpowers
- P1: Red Flags table (Thought|Reality) — scope-check.md, ship.md, tech-lead.md (convert), qa-lead.md
- P2: Verification Gate (Iron Law) — senior-developer.md, junior-developer.md, qa-engineer.md
- P3: scripts/review-package.sh (tạo mới) + tip trong tech-lead.md và senior-developer.md
- P4: Progress Ledger vào code-migrator.md và github-repo-researcher.md; _workspace/ vào .gitignore
- P5: Chuẩn hóa description trigger — junior-developer.md ("PHẢI dùng agent này khi:")
- P6: .claude/commands/writing-agent-skill.md (tạo mới — TDD-for-documentation)
- P7: Turn count caution vào CLAUDE.md §13.1b và §13.2
- Cập nhật RESEARCH-superpowers-2026-07-12.md bảng trạng thái → tất cả P1-P7 đều ✅
- Cập nhật plan file: Bước 2.1 và 2.2 → ✅

Plan: .claude/plans/PLAN-superpowers-research-2026-07-12.md
</commit_message>
<xml_diff>
--- a/.claude/agents/code-migrator.docx
+++ b/.claude/agents/code-migrator.docx
@@ -223,6 +223,100 @@
           <w:sz w:val="21"/>
         </w:rPr>
         <w:t>, áp dụng idiom đúng của stack đích.</w:t>
+      </w:r>
+    </w:p>
+    <w:p>
+      <w:pPr>
+        <w:pStyle w:val="Heading2"/>
+        <w:spacing w:before="200" w:after="80"/>
+      </w:pPr>
+      <w:r>
+        <w:rPr>
+          <w:color w:val="F05922"/>
+          <w:sz w:val="28"/>
+        </w:rPr>
+        <w:t>Khi nào KHÔNG dùng</w:t>
+      </w:r>
+    </w:p>
+    <w:p>
+      <w:pPr>
+        <w:pStyle w:val="ListBullet"/>
+        <w:spacing w:after="20"/>
+        <w:ind w:left="283"/>
+      </w:pPr>
+      <w:r>
+        <w:rPr>
+          <w:sz w:val="21"/>
+        </w:rPr>
+        <w:t xml:space="preserve">User chỉ muốn viết tính năng mới hoặc fix bug trong stack hiện tại (không đổi framework/ngôn ngữ) → dùng </w:t>
+      </w:r>
+      <w:r>
+        <w:rPr>
+          <w:rFonts w:ascii="Courier New" w:hAnsi="Courier New"/>
+          <w:color w:val="F05922"/>
+          <w:sz w:val="21"/>
+        </w:rPr>
+        <w:t>senior-developer</w:t>
+      </w:r>
+      <w:r>
+        <w:rPr>
+          <w:sz w:val="21"/>
+        </w:rPr>
+        <w:t>/</w:t>
+      </w:r>
+      <w:r>
+        <w:rPr>
+          <w:rFonts w:ascii="Courier New" w:hAnsi="Courier New"/>
+          <w:color w:val="F05922"/>
+          <w:sz w:val="21"/>
+        </w:rPr>
+        <w:t>junior-developer</w:t>
+      </w:r>
+      <w:r>
+        <w:rPr>
+          <w:sz w:val="21"/>
+        </w:rPr>
+        <w:t xml:space="preserve"> bình thường.</w:t>
+      </w:r>
+    </w:p>
+    <w:p>
+      <w:pPr>
+        <w:pStyle w:val="ListBullet"/>
+        <w:spacing w:after="20"/>
+        <w:ind w:left="283"/>
+      </w:pPr>
+      <w:r>
+        <w:rPr>
+          <w:sz w:val="21"/>
+        </w:rPr>
+        <w:t xml:space="preserve">Chỉ nâng cấp version cùng framework không đổi idiom lớn (VD: .NET 6 → .NET 8 mà không đổi UI stack) và không có breaking change kiến trúc → cân nhắc giao thẳng </w:t>
+      </w:r>
+      <w:r>
+        <w:rPr>
+          <w:rFonts w:ascii="Courier New" w:hAnsi="Courier New"/>
+          <w:color w:val="F05922"/>
+          <w:sz w:val="21"/>
+        </w:rPr>
+        <w:t>senior-developer</w:t>
+      </w:r>
+      <w:r>
+        <w:rPr>
+          <w:sz w:val="21"/>
+        </w:rPr>
+        <w:t>, không cần khảo sát Opus đầy đủ.</w:t>
+      </w:r>
+    </w:p>
+    <w:p>
+      <w:pPr>
+        <w:pStyle w:val="ListBullet"/>
+        <w:spacing w:after="20"/>
+        <w:ind w:left="283"/>
+      </w:pPr>
+      <w:r>
+        <w:rPr>
+          <w:sz w:val="21"/>
+        </w:rPr>
+        <w:t>Refactor nội bộ không đổi stack đích → dùng WF-REFACTOR.</w:t>
       </w:r>
     </w:p>
     <w:p>
@@ -1938,6 +2032,137 @@
           <w:sz w:val="21"/>
         </w:rPr>
         <w:t xml:space="preserve"> (xem §16, §20 CLAUDE.md — chia session nếu ≥6 bước).</w:t>
+      </w:r>
+    </w:p>
+    <w:p>
+      <w:pPr>
+        <w:pStyle w:val="ListBullet"/>
+        <w:spacing w:after="20"/>
+        <w:ind w:left="283"/>
+      </w:pPr>
+      <w:r>
+        <w:rPr>
+          <w:sz w:val="21"/>
+        </w:rPr>
+        <w:t xml:space="preserve">[ ] </w:t>
+      </w:r>
+      <w:r>
+        <w:rPr>
+          <w:b/>
+          <w:sz w:val="21"/>
+        </w:rPr>
+        <w:t>Trước khi trình plan, hiển thị rõ giả định đang đặt ra</w:t>
+      </w:r>
+      <w:r>
+        <w:rPr>
+          <w:sz w:val="21"/>
+        </w:rPr>
+        <w:t xml:space="preserve"> (format dưới) để user sửa ngay nếu sai, thay vì âm thầm giả định rồi migrate sai hướng:</w:t>
+      </w:r>
+    </w:p>
+    <w:p>
+      <w:pPr>
+        <w:spacing w:after="80"/>
+      </w:pPr>
+      <w:r>
+        <w:rPr>
+          <w:rFonts w:ascii="Courier New" w:hAnsi="Courier New"/>
+          <w:color w:val="F05922"/>
+          <w:sz w:val="18"/>
+        </w:rPr>
+        <w:t>`</w:t>
+      </w:r>
+    </w:p>
+    <w:p>
+      <w:pPr>
+        <w:spacing w:after="80"/>
+      </w:pPr>
+      <w:r>
+        <w:rPr>
+          <w:sz w:val="21"/>
+        </w:rPr>
+        <w:t>ASSUMPTIONS I'M MAKING:</w:t>
+      </w:r>
+    </w:p>
+    <w:p>
+      <w:pPr>
+        <w:spacing w:after="20"/>
+        <w:ind w:left="850" w:hanging="283"/>
+      </w:pPr>
+      <w:r>
+        <w:rPr>
+          <w:sz w:val="21"/>
+        </w:rPr>
+        <w:t>1.</w:t>
+        <w:tab/>
+      </w:r>
+      <w:r>
+        <w:rPr>
+          <w:sz w:val="21"/>
+        </w:rPr>
+        <w:t>[giả định về phạm vi — VD: chỉ migrate UI, không đổi business logic]</w:t>
+      </w:r>
+    </w:p>
+    <w:p>
+      <w:pPr>
+        <w:spacing w:after="20"/>
+        <w:ind w:left="850" w:hanging="283"/>
+      </w:pPr>
+      <w:r>
+        <w:rPr>
+          <w:sz w:val="21"/>
+        </w:rPr>
+        <w:t>2.</w:t>
+        <w:tab/>
+      </w:r>
+      <w:r>
+        <w:rPr>
+          <w:sz w:val="21"/>
+        </w:rPr>
+        <w:t>[giả định về behavior parity — VD: giữ nguyên toàn bộ tính năng, kể cả tính năng ít dùng]</w:t>
+      </w:r>
+    </w:p>
+    <w:p>
+      <w:pPr>
+        <w:spacing w:after="20"/>
+        <w:ind w:left="850" w:hanging="283"/>
+      </w:pPr>
+      <w:r>
+        <w:rPr>
+          <w:sz w:val="21"/>
+        </w:rPr>
+        <w:t>3.</w:t>
+        <w:tab/>
+      </w:r>
+      <w:r>
+        <w:rPr>
+          <w:sz w:val="21"/>
+        </w:rPr>
+        <w:t>[giả định về component tái dùng — VD: ưu tiên KztekComponentAvalonia trước khi build mới]</w:t>
+      </w:r>
+    </w:p>
+    <w:p>
+      <w:pPr>
+        <w:spacing w:after="80"/>
+      </w:pPr>
+      <w:r>
+        <w:rPr>
+          <w:sz w:val="21"/>
+        </w:rPr>
+        <w:t>→ Xác nhận lại ngay hoặc tôi sẽ tiếp tục lập plan theo các giả định này.</w:t>
+      </w:r>
+    </w:p>
+    <w:p>
+      <w:pPr>
+        <w:spacing w:after="80"/>
+      </w:pPr>
+      <w:r>
+        <w:rPr>
+          <w:rFonts w:ascii="Courier New" w:hAnsi="Courier New"/>
+          <w:color w:val="F05922"/>
+          <w:sz w:val="18"/>
+        </w:rPr>
+        <w:t>`</w:t>
       </w:r>
     </w:p>
     <w:p>
@@ -10577,6 +10802,198 @@
           <w:color w:val="F05922"/>
           <w:sz w:val="28"/>
         </w:rPr>
+        <w:t>5b. Progress Ledger (bổ sung — học từ obra/superpowers)</w:t>
+      </w:r>
+    </w:p>
+    <w:p>
+      <w:pPr>
+        <w:spacing w:before="40" w:after="40"/>
+        <w:ind w:left="567"/>
+        <w:pBdr>
+          <w:left w:val="single" w:sz="12" w:space="10" w:color="F05922"/>
+        </w:pBdr>
+      </w:pPr>
+      <w:r>
+        <w:rPr>
+          <w:b/>
+          <w:color w:val="4A3F8C"/>
+        </w:rPr>
+        <w:t>Mục đích:</w:t>
+      </w:r>
+      <w:r>
+        <w:rPr>
+          <w:color w:val="4A3F8C"/>
+        </w:rPr>
+        <w:t xml:space="preserve"> Plan file (</w:t>
+      </w:r>
+      <w:r>
+        <w:rPr>
+          <w:rFonts w:ascii="Courier New" w:hAnsi="Courier New"/>
+          <w:color w:val="F05922"/>
+          <w:sz w:val="18"/>
+        </w:rPr>
+        <w:t>.claude/plans/PLAN-*.md</w:t>
+      </w:r>
+      <w:r>
+        <w:rPr>
+          <w:color w:val="4A3F8C"/>
+        </w:rPr>
+        <w:t>) là nguồn sự thật chính thức nhưng có nhiều field cần edit. Progress ledger là file nhẹ hơn, chỉ append — phục hồi nhanh khi session bị compact/restart mà không cần đọc lại toàn bộ plan.</w:t>
+      </w:r>
+    </w:p>
+    <w:p>
+      <w:pPr>
+        <w:spacing w:after="80"/>
+      </w:pPr>
+      <w:r>
+        <w:rPr>
+          <w:b/>
+          <w:sz w:val="21"/>
+        </w:rPr>
+        <w:t>Quy tắc:</w:t>
+      </w:r>
+      <w:r>
+        <w:rPr>
+          <w:sz w:val="21"/>
+        </w:rPr>
+        <w:t xml:space="preserve"> Sau mỗi giai đoạn (G1–G7) hoàn thành, append 1 dòng vào </w:t>
+      </w:r>
+      <w:r>
+        <w:rPr>
+          <w:rFonts w:ascii="Courier New" w:hAnsi="Courier New"/>
+          <w:color w:val="F05922"/>
+          <w:sz w:val="18"/>
+        </w:rPr>
+        <w:t>_workspace/progress.md</w:t>
+      </w:r>
+      <w:r>
+        <w:rPr>
+          <w:sz w:val="21"/>
+        </w:rPr>
+        <w:t>:</w:t>
+      </w:r>
+    </w:p>
+    <w:p>
+      <w:pPr>
+        <w:spacing w:before="80" w:after="80"/>
+        <w:ind w:left="283"/>
+        <w:shd w:val="clear" w:color="auto" w:fill="F4F4F8"/>
+      </w:pPr>
+      <w:r>
+        <w:rPr>
+          <w:rFonts w:ascii="Courier New" w:hAnsi="Courier New"/>
+          <w:color w:val="251C53"/>
+          <w:sz w:val="18"/>
+        </w:rPr>
+        <w:t>[YYYY-MM-DD HH:MM] Bước G&lt;N&gt;: complete (artifact: &lt;tên file&gt;, commit: &lt;hash ngắn&gt;)</w:t>
+      </w:r>
+    </w:p>
+    <w:p>
+      <w:pPr>
+        <w:spacing w:after="80"/>
+      </w:pPr>
+      <w:r>
+        <w:rPr>
+          <w:b/>
+          <w:sz w:val="21"/>
+        </w:rPr>
+        <w:t>Ví dụ:</w:t>
+      </w:r>
+    </w:p>
+    <w:p>
+      <w:pPr>
+        <w:spacing w:before="80" w:after="80"/>
+        <w:ind w:left="283"/>
+        <w:shd w:val="clear" w:color="auto" w:fill="F4F4F8"/>
+      </w:pPr>
+      <w:r>
+        <w:rPr>
+          <w:rFonts w:ascii="Courier New" w:hAnsi="Courier New"/>
+          <w:color w:val="251C53"/>
+          <w:sz w:val="18"/>
+        </w:rPr>
+        <w:t>[2026-07-12 10:15] Bước G1: complete (artifact: ADR-migrate-ipgsv4.md, commit: abc1234)</w:t>
+        <w:br/>
+        <w:t>[2026-07-12 14:30] Bước G2: complete (artifact: inventory-table trong ADR, commit: def5678)</w:t>
+      </w:r>
+    </w:p>
+    <w:p>
+      <w:pPr>
+        <w:pStyle w:val="ListBullet"/>
+        <w:spacing w:after="20"/>
+        <w:ind w:left="283"/>
+      </w:pPr>
+      <w:r>
+        <w:rPr>
+          <w:sz w:val="21"/>
+        </w:rPr>
+        <w:t xml:space="preserve">File </w:t>
+      </w:r>
+      <w:r>
+        <w:rPr>
+          <w:rFonts w:ascii="Courier New" w:hAnsi="Courier New"/>
+          <w:color w:val="F05922"/>
+          <w:sz w:val="21"/>
+        </w:rPr>
+        <w:t>_workspace/progress.md</w:t>
+      </w:r>
+      <w:r>
+        <w:rPr>
+          <w:sz w:val="21"/>
+        </w:rPr>
+        <w:t xml:space="preserve"> là git-ignored (§11.0 CLAUDE.md) — chỉ dùng cục bộ, không commit.</w:t>
+      </w:r>
+    </w:p>
+    <w:p>
+      <w:pPr>
+        <w:pStyle w:val="ListBullet"/>
+        <w:spacing w:after="20"/>
+        <w:ind w:left="283"/>
+      </w:pPr>
+      <w:r>
+        <w:rPr>
+          <w:sz w:val="21"/>
+        </w:rPr>
+        <w:t xml:space="preserve">Khi session bị compact → đọc </w:t>
+      </w:r>
+      <w:r>
+        <w:rPr>
+          <w:rFonts w:ascii="Courier New" w:hAnsi="Courier New"/>
+          <w:color w:val="F05922"/>
+          <w:sz w:val="21"/>
+        </w:rPr>
+        <w:t>_workspace/progress.md</w:t>
+      </w:r>
+      <w:r>
+        <w:rPr>
+          <w:sz w:val="21"/>
+        </w:rPr>
+        <w:t xml:space="preserve"> để biết ngay giai đoạn cuối đã xong, không cần đọc lại toàn bộ plan.</w:t>
+      </w:r>
+    </w:p>
+    <w:p>
+      <w:pPr>
+        <w:pStyle w:val="ListBullet"/>
+        <w:spacing w:after="20"/>
+        <w:ind w:left="283"/>
+      </w:pPr>
+      <w:r>
+        <w:rPr>
+          <w:sz w:val="21"/>
+        </w:rPr>
+        <w:t>Nếu ledger bị xóa → phục hồi bằng cách đọc plan file và các artifact đã commit.</w:t>
+      </w:r>
+    </w:p>
+    <w:p>
+      <w:pPr>
+        <w:pStyle w:val="Heading2"/>
+        <w:spacing w:before="200" w:after="80"/>
+      </w:pPr>
+      <w:r>
+        <w:rPr>
+          <w:color w:val="F05922"/>
+          <w:sz w:val="28"/>
+        </w:rPr>
         <w:t>6. Escalate lên Tech Lead khi</w:t>
       </w:r>
     </w:p>
@@ -10918,6 +11335,126 @@
         <w:t>### Build: [✅ 0 lỗi]   ### Publish linux-x64: [✅ Pass]   ### Component tái dùng: [list]   ### Build mới: [list]</w:t>
         <w:br/>
         <w:t>### Tài liệu: [ ] CODE-GRAPH [ ] ADR/mapping [ ] TDD [ ] Lesson — hoặc lý do không cần</w:t>
+      </w:r>
+    </w:p>
+    <w:p>
+      <w:pPr>
+        <w:pStyle w:val="Heading2"/>
+        <w:spacing w:before="200" w:after="80"/>
+      </w:pPr>
+      <w:r>
+        <w:rPr>
+          <w:color w:val="F05922"/>
+          <w:sz w:val="28"/>
+        </w:rPr>
+        <w:t>Verification (done gate — PHẢI tick đủ trước khi báo hoàn thành G6)</w:t>
+      </w:r>
+    </w:p>
+    <w:p>
+      <w:pPr>
+        <w:pStyle w:val="ListBullet"/>
+        <w:spacing w:after="20"/>
+        <w:ind w:left="283"/>
+      </w:pPr>
+      <w:r>
+        <w:rPr>
+          <w:sz w:val="21"/>
+        </w:rPr>
+        <w:t>[ ] 100% dòng inventory (§2A Cấp 0-2) có trạng thái ✅/⚠️ rõ ràng, không còn dòng "chưa rõ".</w:t>
+      </w:r>
+    </w:p>
+    <w:p>
+      <w:pPr>
+        <w:pStyle w:val="ListBullet"/>
+        <w:spacing w:after="20"/>
+        <w:ind w:left="283"/>
+      </w:pPr>
+      <w:r>
+        <w:rPr>
+          <w:sz w:val="21"/>
+        </w:rPr>
+        <w:t xml:space="preserve">[ ] Build sạch cả </w:t>
+      </w:r>
+      <w:r>
+        <w:rPr>
+          <w:rFonts w:ascii="Courier New" w:hAnsi="Courier New"/>
+          <w:color w:val="F05922"/>
+          <w:sz w:val="21"/>
+        </w:rPr>
+        <w:t>win-x64</w:t>
+      </w:r>
+      <w:r>
+        <w:rPr>
+          <w:sz w:val="21"/>
+        </w:rPr>
+        <w:t xml:space="preserve"> và </w:t>
+      </w:r>
+      <w:r>
+        <w:rPr>
+          <w:rFonts w:ascii="Courier New" w:hAnsi="Courier New"/>
+          <w:color w:val="F05922"/>
+          <w:sz w:val="21"/>
+        </w:rPr>
+        <w:t>linux-x64</w:t>
+      </w:r>
+      <w:r>
+        <w:rPr>
+          <w:sz w:val="21"/>
+        </w:rPr>
+        <w:t xml:space="preserve"> (nếu đích cross-platform); publish thử </w:t>
+      </w:r>
+      <w:r>
+        <w:rPr>
+          <w:rFonts w:ascii="Courier New" w:hAnsi="Courier New"/>
+          <w:color w:val="F05922"/>
+          <w:sz w:val="21"/>
+        </w:rPr>
+        <w:t>linux-x64</w:t>
+      </w:r>
+      <w:r>
+        <w:rPr>
+          <w:sz w:val="21"/>
+        </w:rPr>
+        <w:t xml:space="preserve"> pass.</w:t>
+      </w:r>
+    </w:p>
+    <w:p>
+      <w:pPr>
+        <w:pStyle w:val="ListBullet"/>
+        <w:spacing w:after="20"/>
+        <w:ind w:left="283"/>
+      </w:pPr>
+      <w:r>
+        <w:rPr>
+          <w:sz w:val="21"/>
+        </w:rPr>
+        <w:t>[ ] Dependency re-check cuối không phát sinh thư viện mới ngoài kế hoạch, hoặc đã phân loại Linux-OK.</w:t>
+      </w:r>
+    </w:p>
+    <w:p>
+      <w:pPr>
+        <w:pStyle w:val="ListBullet"/>
+        <w:spacing w:after="20"/>
+        <w:ind w:left="283"/>
+      </w:pPr>
+      <w:r>
+        <w:rPr>
+          <w:sz w:val="21"/>
+        </w:rPr>
+        <w:t>[ ] QA Engineer đã smoke test path chính và đối chiếu behavior parity — không tự khai DONE khi QA chưa verify.</w:t>
+      </w:r>
+    </w:p>
+    <w:p>
+      <w:pPr>
+        <w:pStyle w:val="ListBullet"/>
+        <w:spacing w:after="20"/>
+        <w:ind w:left="283"/>
+      </w:pPr>
+      <w:r>
+        <w:rPr>
+          <w:sz w:val="21"/>
+        </w:rPr>
+        <w:t>[ ] Project nguồn không bị sửa/xóa (chỉ đọc), code mới nằm đúng folder/project riêng theo §1A.</w:t>
       </w:r>
     </w:p>
     <w:sectPr>

</xml_diff>

<commit_message>
Bỏ Plugin, chuyển plans -> docs/plans, bổ sung scripts kiosk, dọn KztekComponent thừa
- Loại bỏ cơ chế Claude Code Plugin (.claude-plugin/, agents|commands|hooks root,
  PLUGIN-SETUP.md, sync-plugin-content.sh, .gitattributes) — quay về chuẩn project
  Claude Code thường (chỉ .claude/), giống các project khác đang dùng.
- Đồng bộ CLAUDE.md/CORE.md/task-planner.md/code-migrator.md từ project iPGSv4 KIOSK:
  cấu trúc Plan v2 (PLAN-MASTER.md + steps/) và rule §20.4 (tách UI UserControl).
- Chuyển .claude/plans/ -> docs/plans/ theo quy ước Plan v2 mới.
- Fix YAML frontmatter (description chưa quote gây parser fail ngầm) cho cto.md,
  verify-pr.md, gen-build-deb.md.
- Bổ sung skill gen-build-deb, vite-react-setup, PLAN-MASTER/STEP-template.
- Bổ sung scripts/linux-deb, linux-kiosk, windows-tools (tham khảo pattern deploy kiosk).
- Xóa KztekComponent/KztekComponentAvalonia (bản DLL/copy thừa, không liên quan
  framework agent, đã hợp nhất về E:\KZTEK\Code_Git\5.BaseUI).
</commit_message>
<xml_diff>
--- a/.claude/agents/code-migrator.docx
+++ b/.claude/agents/code-migrator.docx
@@ -2012,7 +2012,7 @@
           <w:color w:val="F05922"/>
           <w:sz w:val="21"/>
         </w:rPr>
-        <w:t>.claude/plans/PLAN-[migration-slug]-[YYYY-MM-DD].md</w:t>
+        <w:t>docs/plans/PLAN-[migration-slug]-[YYYY-MM-DD].md</w:t>
       </w:r>
       <w:r>
         <w:rPr>
@@ -10832,7 +10832,7 @@
           <w:color w:val="F05922"/>
           <w:sz w:val="18"/>
         </w:rPr>
-        <w:t>.claude/plans/PLAN-*.md</w:t>
+        <w:t>docs/plans/PLAN-*.md</w:t>
       </w:r>
       <w:r>
         <w:rPr>
@@ -11093,7 +11093,7 @@
           <w:color w:val="F05922"/>
           <w:sz w:val="21"/>
         </w:rPr>
-        <w:t>.claude/plans/PLAN-[migration-slug]-[YYYY-MM-DD].md</w:t>
+        <w:t>docs/plans/PLAN-[migration-slug]-[YYYY-MM-DD].md</w:t>
       </w:r>
       <w:r>
         <w:rPr>

</xml_diff>